<commit_message>
commit per gitignore file word temporanei ignorati
</commit_message>
<xml_diff>
--- a/3_Documentazione/Documentazione_Sprint3.docx
+++ b/3_Documentazione/Documentazione_Sprint3.docx
@@ -646,7 +646,7 @@
           <w:r>
             <w:fldChar w:fldCharType="separate"/>
           </w:r>
-          <w:hyperlink w:anchor="_Toc195706424" w:history="1">
+          <w:hyperlink w:anchor="_Toc195706565" w:history="1">
             <w:r>
               <w:rPr>
                 <w:rStyle w:val="Collegamentoipertestuale"/>
@@ -673,7 +673,7 @@
                 <w:noProof/>
                 <w:webHidden/>
               </w:rPr>
-              <w:instrText xml:space="preserve"> PAGEREF _Toc195706424 \h </w:instrText>
+              <w:instrText xml:space="preserve"> PAGEREF _Toc195706565 \h </w:instrText>
             </w:r>
             <w:r>
               <w:rPr>
@@ -716,7 +716,7 @@
               <w:lang w:eastAsia="it-CH"/>
             </w:rPr>
           </w:pPr>
-          <w:hyperlink w:anchor="_Toc195706425" w:history="1">
+          <w:hyperlink w:anchor="_Toc195706566" w:history="1">
             <w:r>
               <w:rPr>
                 <w:rStyle w:val="Collegamentoipertestuale"/>
@@ -743,7 +743,7 @@
                 <w:noProof/>
                 <w:webHidden/>
               </w:rPr>
-              <w:instrText xml:space="preserve"> PAGEREF _Toc195706425 \h </w:instrText>
+              <w:instrText xml:space="preserve"> PAGEREF _Toc195706566 \h </w:instrText>
             </w:r>
             <w:r>
               <w:rPr>
@@ -786,7 +786,7 @@
               <w:lang w:eastAsia="it-CH"/>
             </w:rPr>
           </w:pPr>
-          <w:hyperlink w:anchor="_Toc195706426" w:history="1">
+          <w:hyperlink w:anchor="_Toc195706567" w:history="1">
             <w:r>
               <w:rPr>
                 <w:rStyle w:val="Collegamentoipertestuale"/>
@@ -813,7 +813,7 @@
                 <w:noProof/>
                 <w:webHidden/>
               </w:rPr>
-              <w:instrText xml:space="preserve"> PAGEREF _Toc195706426 \h </w:instrText>
+              <w:instrText xml:space="preserve"> PAGEREF _Toc195706567 \h </w:instrText>
             </w:r>
             <w:r>
               <w:rPr>
@@ -856,7 +856,7 @@
               <w:lang w:eastAsia="it-CH"/>
             </w:rPr>
           </w:pPr>
-          <w:hyperlink w:anchor="_Toc195706427" w:history="1">
+          <w:hyperlink w:anchor="_Toc195706568" w:history="1">
             <w:r>
               <w:rPr>
                 <w:rStyle w:val="Collegamentoipertestuale"/>
@@ -883,7 +883,7 @@
                 <w:noProof/>
                 <w:webHidden/>
               </w:rPr>
-              <w:instrText xml:space="preserve"> PAGEREF _Toc195706427 \h </w:instrText>
+              <w:instrText xml:space="preserve"> PAGEREF _Toc195706568 \h </w:instrText>
             </w:r>
             <w:r>
               <w:rPr>
@@ -926,7 +926,7 @@
               <w:lang w:eastAsia="it-CH"/>
             </w:rPr>
           </w:pPr>
-          <w:hyperlink w:anchor="_Toc195706428" w:history="1">
+          <w:hyperlink w:anchor="_Toc195706569" w:history="1">
             <w:r>
               <w:rPr>
                 <w:rStyle w:val="Collegamentoipertestuale"/>
@@ -953,7 +953,7 @@
                 <w:noProof/>
                 <w:webHidden/>
               </w:rPr>
-              <w:instrText xml:space="preserve"> PAGEREF _Toc195706428 \h </w:instrText>
+              <w:instrText xml:space="preserve"> PAGEREF _Toc195706569 \h </w:instrText>
             </w:r>
             <w:r>
               <w:rPr>
@@ -996,7 +996,7 @@
               <w:lang w:eastAsia="it-CH"/>
             </w:rPr>
           </w:pPr>
-          <w:hyperlink w:anchor="_Toc195706429" w:history="1">
+          <w:hyperlink w:anchor="_Toc195706570" w:history="1">
             <w:r>
               <w:rPr>
                 <w:rStyle w:val="Collegamentoipertestuale"/>
@@ -1023,7 +1023,7 @@
                 <w:noProof/>
                 <w:webHidden/>
               </w:rPr>
-              <w:instrText xml:space="preserve"> PAGEREF _Toc195706429 \h </w:instrText>
+              <w:instrText xml:space="preserve"> PAGEREF _Toc195706570 \h </w:instrText>
             </w:r>
             <w:r>
               <w:rPr>
@@ -1070,46 +1070,57 @@
       <w:r>
         <w:br w:type="page"/>
       </w:r>
-      <w:bookmarkStart w:id="0" w:name="_GoBack"/>
+    </w:p>
+    <w:p>
+      <w:pPr>
+        <w:pStyle w:val="Titolo1"/>
+      </w:pPr>
+      <w:bookmarkStart w:id="0" w:name="_Toc195706565"/>
+      <w:r>
+        <w:lastRenderedPageBreak/>
+        <w:t>Obbiettivo</w:t>
+      </w:r>
       <w:bookmarkEnd w:id="0"/>
     </w:p>
     <w:p>
-      <w:pPr>
-        <w:pStyle w:val="Titolo1"/>
-      </w:pPr>
-      <w:bookmarkStart w:id="1" w:name="_Toc195706424"/>
-      <w:r>
-        <w:lastRenderedPageBreak/>
-        <w:t>Obbiettivo</w:t>
-      </w:r>
-      <w:bookmarkEnd w:id="1"/>
+      <w:r>
+        <w:t>L’o</w:t>
+      </w:r>
+      <w:r>
+        <w:t>bbiettivo</w:t>
+      </w:r>
+      <w:r>
+        <w:t xml:space="preserve"> </w:t>
+      </w:r>
+      <w:r>
+        <w:t>principale</w:t>
+      </w:r>
+      <w:r>
+        <w:t xml:space="preserve"> di questo sprint è</w:t>
+      </w:r>
+      <w:r>
+        <w:t xml:space="preserve"> l’implementazione, anche se con </w:t>
+      </w:r>
+      <w:r>
+        <w:t>qualche</w:t>
+      </w:r>
+      <w:r>
+        <w:t xml:space="preserve"> problema con relazione tra nota-attachments</w:t>
+      </w:r>
     </w:p>
     <w:p>
-      <w:r>
-        <w:t xml:space="preserve">Obbiettivo </w:t>
+      <w:pPr>
+        <w:pStyle w:val="Titolo1"/>
+      </w:pPr>
+      <w:bookmarkStart w:id="1" w:name="_Toc195706566"/>
+      <w:r>
+        <w:t xml:space="preserve">Pianificazione </w:t>
       </w:r>
       <w:proofErr w:type="spellStart"/>
       <w:r>
-        <w:t>èprincipale</w:t>
-      </w:r>
-      <w:proofErr w:type="spellEnd"/>
-      <w:r>
-        <w:t xml:space="preserve"> l’implementazione, anche se con un problema con relazione tra nota-attachments</w:t>
-      </w:r>
-    </w:p>
-    <w:p>
-      <w:pPr>
-        <w:pStyle w:val="Titolo1"/>
-      </w:pPr>
-      <w:bookmarkStart w:id="2" w:name="_Toc195706425"/>
-      <w:r>
-        <w:t xml:space="preserve">Pianificazione </w:t>
-      </w:r>
-      <w:proofErr w:type="spellStart"/>
-      <w:r>
         <w:t>Gantt</w:t>
       </w:r>
-      <w:bookmarkEnd w:id="2"/>
+      <w:bookmarkEnd w:id="1"/>
       <w:proofErr w:type="spellEnd"/>
     </w:p>
     <w:p>
@@ -1119,21 +1130,10 @@
         </w:rPr>
       </w:pPr>
       <w:r>
-        <w:t xml:space="preserve">Questo </w:t>
-      </w:r>
-      <w:proofErr w:type="spellStart"/>
-      <w:r>
-        <w:t>Gantt</w:t>
-      </w:r>
-      <w:proofErr w:type="spellEnd"/>
-      <w:r>
-        <w:t xml:space="preserve"> rappresenta il </w:t>
-      </w:r>
-      <w:r>
-        <w:t>terzo</w:t>
-      </w:r>
-      <w:r>
-        <w:t xml:space="preserve"> Sprint del progetto, i tem</w:t>
+        <w:t xml:space="preserve">I </w:t>
+      </w:r>
+      <w:r>
+        <w:t>tem</w:t>
       </w:r>
       <w:r>
         <w:t xml:space="preserve">pi sono stati </w:t>
@@ -1167,12 +1167,14 @@
         </w:rPr>
         <w:br w:type="page"/>
       </w:r>
+      <w:bookmarkStart w:id="2" w:name="_GoBack"/>
+      <w:bookmarkEnd w:id="2"/>
     </w:p>
     <w:p>
       <w:pPr>
         <w:pStyle w:val="Titolo1"/>
       </w:pPr>
-      <w:bookmarkStart w:id="3" w:name="_Toc195706426"/>
+      <w:bookmarkStart w:id="3" w:name="_Toc195706567"/>
       <w:r>
         <w:lastRenderedPageBreak/>
         <w:t>Implementazione</w:t>
@@ -1183,7 +1185,7 @@
       <w:pPr>
         <w:pStyle w:val="Titolo2"/>
       </w:pPr>
-      <w:bookmarkStart w:id="4" w:name="_Toc195706427"/>
+      <w:bookmarkStart w:id="4" w:name="_Toc195706568"/>
       <w:r>
         <w:t>Documentazione</w:t>
       </w:r>
@@ -1198,7 +1200,7 @@
       <w:pPr>
         <w:pStyle w:val="Titolo2"/>
       </w:pPr>
-      <w:bookmarkStart w:id="5" w:name="_Toc195706428"/>
+      <w:bookmarkStart w:id="5" w:name="_Toc195706569"/>
       <w:r>
         <w:t>Database</w:t>
       </w:r>
@@ -1216,7 +1218,7 @@
       <w:pPr>
         <w:pStyle w:val="Titolo2"/>
       </w:pPr>
-      <w:bookmarkStart w:id="6" w:name="_Toc195706429"/>
+      <w:bookmarkStart w:id="6" w:name="_Toc195706570"/>
       <w:r>
         <w:t>Funzionalità</w:t>
       </w:r>
@@ -1417,10 +1419,7 @@
     <w:p>
       <w:pPr>
         <w:pStyle w:val="Paragrafoelenco"/>
-        <w:numPr>
-          <w:ilvl w:val="1"/>
-          <w:numId w:val="7"/>
-        </w:numPr>
+        <w:ind w:left="1440"/>
       </w:pPr>
     </w:p>
     <w:p/>
@@ -4060,7 +4059,7 @@
 </file>
 
 <file path=customXml/itemProps2.xml><?xml version="1.0" encoding="utf-8"?>
-<ds:datastoreItem xmlns:ds="http://schemas.openxmlformats.org/officeDocument/2006/customXml" ds:itemID="{864BAD68-8B0D-4108-A70C-02C4165E9AF4}">
+<ds:datastoreItem xmlns:ds="http://schemas.openxmlformats.org/officeDocument/2006/customXml" ds:itemID="{CBA3BA56-7696-49B3-AB7A-31EAA7203444}">
   <ds:schemaRefs>
     <ds:schemaRef ds:uri="http://schemas.openxmlformats.org/officeDocument/2006/bibliography"/>
   </ds:schemaRefs>

</xml_diff>